<commit_message>
Migration governance: sysadmin owns the OS in-place upgrade, DBA owns everything after the OS hand-off; clone only uncertain paths
Co-Authored-By: Claude Opus 5.5 <noreply@anthropic.com>
</commit_message>
<xml_diff>
--- a/migration-governance/SERVER-PAGE-TEMPLATE.docx
+++ b/migration-governance/SERVER-PAGE-TEMPLATE.docx
@@ -3407,7 +3407,50 @@
                 <w:i/>
                 <w:color w:val="6B7785"/>
               </w:rPr>
-              <w:t xml:space="preserve">Side-by-side · in-place OS · backup/restore · log shipping · consolidation]</w:t>
+              <w:t xml:space="preserve">In-place (1st choice) · side-by-side (2nd) · consolidation]</w:t>
+            </w:r>
+          </w:p>
+        </w:tc>
+      </w:tr>
+      <w:tr>
+        <w:tc>
+          <w:tcPr>
+            <w:tcW w:w="2822" w:type="dxa"/>
+            <w:shd w:val="clear" w:color="auto" w:fill="DBE8F4"/>
+          </w:tcPr>
+          <w:p>
+            <w:pPr>
+              <w:pStyle w:val="TableText"/>
+            </w:pPr>
+            <w:r>
+              <w:rPr>
+                <w:b/>
+              </w:rPr>
+              <w:t xml:space="preserve">Path certainty</w:t>
+            </w:r>
+          </w:p>
+        </w:tc>
+        <w:tc>
+          <w:tcPr>
+            <w:tcW w:w="7258" w:type="dxa"/>
+          </w:tcPr>
+          <w:p>
+            <w:pPr>
+              <w:pStyle w:val="TableText"/>
+            </w:pPr>
+            <w:r>
+              <w:rPr>
+                <w:i/>
+                <w:color w:val="6B7785"/>
+              </w:rPr>
+              <w:t xml:space="preserve">[</w:t>
+            </w:r>
+            <w:r>
+              <w:rPr>
+                <w:i/>
+                <w:color w:val="6B7785"/>
+              </w:rPr>
+              <w:t xml:space="preserve">Proven (lab or earlier server) · Uncertain → clone first]</w:t>
             </w:r>
           </w:p>
         </w:tc>
@@ -3866,10 +3909,10 @@
         </w:tblCellMar>
       </w:tblPr>
       <w:tblGrid>
-        <w:gridCol w:w="7069"/>
-        <w:gridCol w:w="1440"/>
-        <w:gridCol w:w="785"/>
-        <w:gridCol w:w="786"/>
+        <w:gridCol w:w="4581"/>
+        <w:gridCol w:w="1298"/>
+        <w:gridCol w:w="1069"/>
+        <w:gridCol w:w="3132"/>
       </w:tblGrid>
       <w:tr>
         <w:trPr>
@@ -3877,7 +3920,7 @@
         </w:trPr>
         <w:tc>
           <w:tcPr>
-            <w:tcW w:w="7069" w:type="dxa"/>
+            <w:tcW w:w="4581" w:type="dxa"/>
             <w:shd w:val="clear" w:color="auto" w:fill="1B4A78"/>
           </w:tcPr>
           <w:p>
@@ -3895,7 +3938,7 @@
         </w:tc>
         <w:tc>
           <w:tcPr>
-            <w:tcW w:w="1440" w:type="dxa"/>
+            <w:tcW w:w="1298" w:type="dxa"/>
             <w:shd w:val="clear" w:color="auto" w:fill="1B4A78"/>
           </w:tcPr>
           <w:p>
@@ -3913,7 +3956,7 @@
         </w:tc>
         <w:tc>
           <w:tcPr>
-            <w:tcW w:w="785" w:type="dxa"/>
+            <w:tcW w:w="1069" w:type="dxa"/>
             <w:shd w:val="clear" w:color="auto" w:fill="1B4A78"/>
           </w:tcPr>
           <w:p>
@@ -3931,7 +3974,7 @@
         </w:tc>
         <w:tc>
           <w:tcPr>
-            <w:tcW w:w="786" w:type="dxa"/>
+            <w:tcW w:w="3132" w:type="dxa"/>
             <w:shd w:val="clear" w:color="auto" w:fill="1B4A78"/>
           </w:tcPr>
           <w:p>
@@ -3951,21 +3994,109 @@
       <w:tr>
         <w:tc>
           <w:tcPr>
-            <w:tcW w:w="7069" w:type="dxa"/>
-          </w:tcPr>
-          <w:p>
-            <w:pPr>
-              <w:pStyle w:val="TableText"/>
-            </w:pPr>
-            <w:r>
-              <w:rPr/>
-              <w:t xml:space="preserve">Server built to the standard (OS, patches, OU, agents)</w:t>
-            </w:r>
-          </w:p>
-        </w:tc>
-        <w:tc>
-          <w:tcPr>
-            <w:tcW w:w="1440" w:type="dxa"/>
+            <w:tcW w:w="4581" w:type="dxa"/>
+          </w:tcPr>
+          <w:p>
+            <w:pPr>
+              <w:pStyle w:val="TableText"/>
+            </w:pPr>
+            <w:r>
+              <w:rPr>
+                <w:i/>
+                <w:color w:val="6B7785"/>
+              </w:rPr>
+              <w:t xml:space="preserve">In-place:</w:t>
+            </w:r>
+            <w:r>
+              <w:rPr/>
+              <w:t xml:space="preserve"> clone run, </w:t>
+            </w:r>
+            <w:r>
+              <w:rPr>
+                <w:b/>
+              </w:rPr>
+              <w:t xml:space="preserve">only if the path is uncertain</w:t>
+            </w:r>
+          </w:p>
+        </w:tc>
+        <w:tc>
+          <w:tcPr>
+            <w:tcW w:w="1298" w:type="dxa"/>
+          </w:tcPr>
+          <w:p>
+            <w:pPr>
+              <w:pStyle w:val="TableText"/>
+            </w:pPr>
+            <w:r>
+              <w:rPr/>
+              <w:t xml:space="preserve">Not started · N/A</w:t>
+            </w:r>
+          </w:p>
+        </w:tc>
+        <w:tc>
+          <w:tcPr>
+            <w:tcW w:w="1069" w:type="dxa"/>
+          </w:tcPr>
+          <w:p>
+            <w:pPr>
+              <w:pStyle w:val="TableText"/>
+            </w:pPr>
+            <w:r>
+              <w:rPr/>
+              <w:t xml:space="preserve">Sysadmin</w:t>
+            </w:r>
+          </w:p>
+        </w:tc>
+        <w:tc>
+          <w:tcPr>
+            <w:tcW w:w="3132" w:type="dxa"/>
+          </w:tcPr>
+          <w:p>
+            <w:pPr>
+              <w:pStyle w:val="TableText"/>
+            </w:pPr>
+            <w:r>
+              <w:rPr>
+                <w:i/>
+                <w:color w:val="6B7785"/>
+              </w:rPr>
+              <w:t xml:space="preserve">[</w:t>
+            </w:r>
+            <w:r>
+              <w:rPr>
+                <w:i/>
+                <w:color w:val="6B7785"/>
+              </w:rPr>
+              <w:t xml:space="preserve">proven or uncertain, and why]</w:t>
+            </w:r>
+          </w:p>
+        </w:tc>
+      </w:tr>
+      <w:tr>
+        <w:tc>
+          <w:tcPr>
+            <w:tcW w:w="4581" w:type="dxa"/>
+          </w:tcPr>
+          <w:p>
+            <w:pPr>
+              <w:pStyle w:val="TableText"/>
+            </w:pPr>
+            <w:r>
+              <w:rPr>
+                <w:i/>
+                <w:color w:val="6B7785"/>
+              </w:rPr>
+              <w:t xml:space="preserve">In-place:</w:t>
+            </w:r>
+            <w:r>
+              <w:rPr/>
+              <w:t xml:space="preserve"> OS upgrade and hardening</w:t>
+            </w:r>
+          </w:p>
+        </w:tc>
+        <w:tc>
+          <w:tcPr>
+            <w:tcW w:w="1298" w:type="dxa"/>
           </w:tcPr>
           <w:p>
             <w:pPr>
@@ -3979,29 +4110,193 @@
         </w:tc>
         <w:tc>
           <w:tcPr>
-            <w:tcW w:w="785" w:type="dxa"/>
-          </w:tcPr>
-          <w:p>
-            <w:pPr>
-              <w:pStyle w:val="TableText"/>
-            </w:pPr>
-          </w:p>
-        </w:tc>
-        <w:tc>
-          <w:tcPr>
-            <w:tcW w:w="786" w:type="dxa"/>
-          </w:tcPr>
-          <w:p>
-            <w:pPr>
-              <w:pStyle w:val="TableText"/>
-            </w:pPr>
-          </w:p>
-        </w:tc>
-      </w:tr>
-      <w:tr>
-        <w:tc>
-          <w:tcPr>
-            <w:tcW w:w="7069" w:type="dxa"/>
+            <w:tcW w:w="1069" w:type="dxa"/>
+          </w:tcPr>
+          <w:p>
+            <w:pPr>
+              <w:pStyle w:val="TableText"/>
+            </w:pPr>
+            <w:r>
+              <w:rPr/>
+              <w:t xml:space="preserve">Sysadmin</w:t>
+            </w:r>
+          </w:p>
+        </w:tc>
+        <w:tc>
+          <w:tcPr>
+            <w:tcW w:w="3132" w:type="dxa"/>
+          </w:tcPr>
+          <w:p>
+            <w:pPr>
+              <w:pStyle w:val="TableText"/>
+            </w:pPr>
+            <w:r>
+              <w:rPr>
+                <w:i/>
+                <w:color w:val="6B7785"/>
+              </w:rPr>
+              <w:t xml:space="preserve">[</w:t>
+            </w:r>
+            <w:r>
+              <w:rPr>
+                <w:i/>
+                <w:color w:val="6B7785"/>
+              </w:rPr>
+              <w:t xml:space="preserve">OS hops, snapshots]</w:t>
+            </w:r>
+          </w:p>
+        </w:tc>
+      </w:tr>
+      <w:tr>
+        <w:tc>
+          <w:tcPr>
+            <w:tcW w:w="4581" w:type="dxa"/>
+          </w:tcPr>
+          <w:p>
+            <w:pPr>
+              <w:pStyle w:val="TableText"/>
+            </w:pPr>
+            <w:r>
+              <w:rPr>
+                <w:i/>
+                <w:color w:val="6B7785"/>
+              </w:rPr>
+              <w:t xml:space="preserve">In-place:</w:t>
+            </w:r>
+            <w:r>
+              <w:rPr/>
+              <w:t xml:space="preserve"> </w:t>
+            </w:r>
+            <w:r>
+              <w:rPr>
+                <w:b/>
+              </w:rPr>
+              <w:t xml:space="preserve">OS hand-off to the DBA</w:t>
+            </w:r>
+          </w:p>
+        </w:tc>
+        <w:tc>
+          <w:tcPr>
+            <w:tcW w:w="1298" w:type="dxa"/>
+          </w:tcPr>
+          <w:p>
+            <w:pPr>
+              <w:pStyle w:val="TableText"/>
+            </w:pPr>
+            <w:r>
+              <w:rPr/>
+              <w:t xml:space="preserve">Not started</w:t>
+            </w:r>
+          </w:p>
+        </w:tc>
+        <w:tc>
+          <w:tcPr>
+            <w:tcW w:w="1069" w:type="dxa"/>
+          </w:tcPr>
+          <w:p>
+            <w:pPr>
+              <w:pStyle w:val="TableText"/>
+            </w:pPr>
+            <w:r>
+              <w:rPr/>
+              <w:t xml:space="preserve">Sysadmin → DBA</w:t>
+            </w:r>
+          </w:p>
+        </w:tc>
+        <w:tc>
+          <w:tcPr>
+            <w:tcW w:w="3132" w:type="dxa"/>
+          </w:tcPr>
+          <w:p>
+            <w:pPr>
+              <w:pStyle w:val="TableText"/>
+            </w:pPr>
+            <w:r>
+              <w:rPr>
+                <w:i/>
+                <w:color w:val="6B7785"/>
+              </w:rPr>
+              <w:t xml:space="preserve">[</w:t>
+            </w:r>
+            <w:r>
+              <w:rPr>
+                <w:i/>
+                <w:color w:val="6B7785"/>
+              </w:rPr>
+              <w:t xml:space="preserve">date]</w:t>
+            </w:r>
+            <w:r>
+              <w:rPr/>
+              <w:t xml:space="preserve"> · from here the DBA is responsible</w:t>
+            </w:r>
+          </w:p>
+        </w:tc>
+      </w:tr>
+      <w:tr>
+        <w:tc>
+          <w:tcPr>
+            <w:tcW w:w="4581" w:type="dxa"/>
+          </w:tcPr>
+          <w:p>
+            <w:pPr>
+              <w:pStyle w:val="TableText"/>
+            </w:pPr>
+            <w:r>
+              <w:rPr>
+                <w:i/>
+                <w:color w:val="6B7785"/>
+              </w:rPr>
+              <w:t xml:space="preserve">Side-by-side:</w:t>
+            </w:r>
+            <w:r>
+              <w:rPr/>
+              <w:t xml:space="preserve"> server built to the standard (OS, patches, OU, agents)</w:t>
+            </w:r>
+          </w:p>
+        </w:tc>
+        <w:tc>
+          <w:tcPr>
+            <w:tcW w:w="1298" w:type="dxa"/>
+          </w:tcPr>
+          <w:p>
+            <w:pPr>
+              <w:pStyle w:val="TableText"/>
+            </w:pPr>
+            <w:r>
+              <w:rPr/>
+              <w:t xml:space="preserve">Not started</w:t>
+            </w:r>
+          </w:p>
+        </w:tc>
+        <w:tc>
+          <w:tcPr>
+            <w:tcW w:w="1069" w:type="dxa"/>
+          </w:tcPr>
+          <w:p>
+            <w:pPr>
+              <w:pStyle w:val="TableText"/>
+            </w:pPr>
+            <w:r>
+              <w:rPr/>
+              <w:t xml:space="preserve">Sysadmin</w:t>
+            </w:r>
+          </w:p>
+        </w:tc>
+        <w:tc>
+          <w:tcPr>
+            <w:tcW w:w="3132" w:type="dxa"/>
+          </w:tcPr>
+          <w:p>
+            <w:pPr>
+              <w:pStyle w:val="TableText"/>
+            </w:pPr>
+          </w:p>
+        </w:tc>
+      </w:tr>
+      <w:tr>
+        <w:tc>
+          <w:tcPr>
+            <w:tcW w:w="4581" w:type="dxa"/>
           </w:tcPr>
           <w:p>
             <w:pPr>
@@ -4015,7 +4310,7 @@
         </w:tc>
         <w:tc>
           <w:tcPr>
-            <w:tcW w:w="1440" w:type="dxa"/>
+            <w:tcW w:w="1298" w:type="dxa"/>
           </w:tcPr>
           <w:p>
             <w:pPr>
@@ -4029,29 +4324,29 @@
         </w:tc>
         <w:tc>
           <w:tcPr>
-            <w:tcW w:w="785" w:type="dxa"/>
-          </w:tcPr>
-          <w:p>
-            <w:pPr>
-              <w:pStyle w:val="TableText"/>
-            </w:pPr>
-          </w:p>
-        </w:tc>
-        <w:tc>
-          <w:tcPr>
-            <w:tcW w:w="786" w:type="dxa"/>
-          </w:tcPr>
-          <w:p>
-            <w:pPr>
-              <w:pStyle w:val="TableText"/>
-            </w:pPr>
-          </w:p>
-        </w:tc>
-      </w:tr>
-      <w:tr>
-        <w:tc>
-          <w:tcPr>
-            <w:tcW w:w="7069" w:type="dxa"/>
+            <w:tcW w:w="1069" w:type="dxa"/>
+          </w:tcPr>
+          <w:p>
+            <w:pPr>
+              <w:pStyle w:val="TableText"/>
+            </w:pPr>
+          </w:p>
+        </w:tc>
+        <w:tc>
+          <w:tcPr>
+            <w:tcW w:w="3132" w:type="dxa"/>
+          </w:tcPr>
+          <w:p>
+            <w:pPr>
+              <w:pStyle w:val="TableText"/>
+            </w:pPr>
+          </w:p>
+        </w:tc>
+      </w:tr>
+      <w:tr>
+        <w:tc>
+          <w:tcPr>
+            <w:tcW w:w="4581" w:type="dxa"/>
           </w:tcPr>
           <w:p>
             <w:pPr>
@@ -4065,7 +4360,7 @@
         </w:tc>
         <w:tc>
           <w:tcPr>
-            <w:tcW w:w="1440" w:type="dxa"/>
+            <w:tcW w:w="1298" w:type="dxa"/>
           </w:tcPr>
           <w:p>
             <w:pPr>
@@ -4079,29 +4374,29 @@
         </w:tc>
         <w:tc>
           <w:tcPr>
-            <w:tcW w:w="785" w:type="dxa"/>
-          </w:tcPr>
-          <w:p>
-            <w:pPr>
-              <w:pStyle w:val="TableText"/>
-            </w:pPr>
-          </w:p>
-        </w:tc>
-        <w:tc>
-          <w:tcPr>
-            <w:tcW w:w="786" w:type="dxa"/>
-          </w:tcPr>
-          <w:p>
-            <w:pPr>
-              <w:pStyle w:val="TableText"/>
-            </w:pPr>
-          </w:p>
-        </w:tc>
-      </w:tr>
-      <w:tr>
-        <w:tc>
-          <w:tcPr>
-            <w:tcW w:w="7069" w:type="dxa"/>
+            <w:tcW w:w="1069" w:type="dxa"/>
+          </w:tcPr>
+          <w:p>
+            <w:pPr>
+              <w:pStyle w:val="TableText"/>
+            </w:pPr>
+          </w:p>
+        </w:tc>
+        <w:tc>
+          <w:tcPr>
+            <w:tcW w:w="3132" w:type="dxa"/>
+          </w:tcPr>
+          <w:p>
+            <w:pPr>
+              <w:pStyle w:val="TableText"/>
+            </w:pPr>
+          </w:p>
+        </w:tc>
+      </w:tr>
+      <w:tr>
+        <w:tc>
+          <w:tcPr>
+            <w:tcW w:w="4581" w:type="dxa"/>
           </w:tcPr>
           <w:p>
             <w:pPr>
@@ -4115,7 +4410,7 @@
         </w:tc>
         <w:tc>
           <w:tcPr>
-            <w:tcW w:w="1440" w:type="dxa"/>
+            <w:tcW w:w="1298" w:type="dxa"/>
           </w:tcPr>
           <w:p>
             <w:pPr>
@@ -4129,29 +4424,29 @@
         </w:tc>
         <w:tc>
           <w:tcPr>
-            <w:tcW w:w="785" w:type="dxa"/>
-          </w:tcPr>
-          <w:p>
-            <w:pPr>
-              <w:pStyle w:val="TableText"/>
-            </w:pPr>
-          </w:p>
-        </w:tc>
-        <w:tc>
-          <w:tcPr>
-            <w:tcW w:w="786" w:type="dxa"/>
-          </w:tcPr>
-          <w:p>
-            <w:pPr>
-              <w:pStyle w:val="TableText"/>
-            </w:pPr>
-          </w:p>
-        </w:tc>
-      </w:tr>
-      <w:tr>
-        <w:tc>
-          <w:tcPr>
-            <w:tcW w:w="7069" w:type="dxa"/>
+            <w:tcW w:w="1069" w:type="dxa"/>
+          </w:tcPr>
+          <w:p>
+            <w:pPr>
+              <w:pStyle w:val="TableText"/>
+            </w:pPr>
+          </w:p>
+        </w:tc>
+        <w:tc>
+          <w:tcPr>
+            <w:tcW w:w="3132" w:type="dxa"/>
+          </w:tcPr>
+          <w:p>
+            <w:pPr>
+              <w:pStyle w:val="TableText"/>
+            </w:pPr>
+          </w:p>
+        </w:tc>
+      </w:tr>
+      <w:tr>
+        <w:tc>
+          <w:tcPr>
+            <w:tcW w:w="4581" w:type="dxa"/>
           </w:tcPr>
           <w:p>
             <w:pPr>
@@ -4165,7 +4460,7 @@
         </w:tc>
         <w:tc>
           <w:tcPr>
-            <w:tcW w:w="1440" w:type="dxa"/>
+            <w:tcW w:w="1298" w:type="dxa"/>
           </w:tcPr>
           <w:p>
             <w:pPr>
@@ -4179,29 +4474,29 @@
         </w:tc>
         <w:tc>
           <w:tcPr>
-            <w:tcW w:w="785" w:type="dxa"/>
-          </w:tcPr>
-          <w:p>
-            <w:pPr>
-              <w:pStyle w:val="TableText"/>
-            </w:pPr>
-          </w:p>
-        </w:tc>
-        <w:tc>
-          <w:tcPr>
-            <w:tcW w:w="786" w:type="dxa"/>
-          </w:tcPr>
-          <w:p>
-            <w:pPr>
-              <w:pStyle w:val="TableText"/>
-            </w:pPr>
-          </w:p>
-        </w:tc>
-      </w:tr>
-      <w:tr>
-        <w:tc>
-          <w:tcPr>
-            <w:tcW w:w="7069" w:type="dxa"/>
+            <w:tcW w:w="1069" w:type="dxa"/>
+          </w:tcPr>
+          <w:p>
+            <w:pPr>
+              <w:pStyle w:val="TableText"/>
+            </w:pPr>
+          </w:p>
+        </w:tc>
+        <w:tc>
+          <w:tcPr>
+            <w:tcW w:w="3132" w:type="dxa"/>
+          </w:tcPr>
+          <w:p>
+            <w:pPr>
+              <w:pStyle w:val="TableText"/>
+            </w:pPr>
+          </w:p>
+        </w:tc>
+      </w:tr>
+      <w:tr>
+        <w:tc>
+          <w:tcPr>
+            <w:tcW w:w="4581" w:type="dxa"/>
           </w:tcPr>
           <w:p>
             <w:pPr>
@@ -4215,7 +4510,7 @@
         </w:tc>
         <w:tc>
           <w:tcPr>
-            <w:tcW w:w="1440" w:type="dxa"/>
+            <w:tcW w:w="1298" w:type="dxa"/>
           </w:tcPr>
           <w:p>
             <w:pPr>
@@ -4229,29 +4524,29 @@
         </w:tc>
         <w:tc>
           <w:tcPr>
-            <w:tcW w:w="785" w:type="dxa"/>
-          </w:tcPr>
-          <w:p>
-            <w:pPr>
-              <w:pStyle w:val="TableText"/>
-            </w:pPr>
-          </w:p>
-        </w:tc>
-        <w:tc>
-          <w:tcPr>
-            <w:tcW w:w="786" w:type="dxa"/>
-          </w:tcPr>
-          <w:p>
-            <w:pPr>
-              <w:pStyle w:val="TableText"/>
-            </w:pPr>
-          </w:p>
-        </w:tc>
-      </w:tr>
-      <w:tr>
-        <w:tc>
-          <w:tcPr>
-            <w:tcW w:w="7069" w:type="dxa"/>
+            <w:tcW w:w="1069" w:type="dxa"/>
+          </w:tcPr>
+          <w:p>
+            <w:pPr>
+              <w:pStyle w:val="TableText"/>
+            </w:pPr>
+          </w:p>
+        </w:tc>
+        <w:tc>
+          <w:tcPr>
+            <w:tcW w:w="3132" w:type="dxa"/>
+          </w:tcPr>
+          <w:p>
+            <w:pPr>
+              <w:pStyle w:val="TableText"/>
+            </w:pPr>
+          </w:p>
+        </w:tc>
+      </w:tr>
+      <w:tr>
+        <w:tc>
+          <w:tcPr>
+            <w:tcW w:w="4581" w:type="dxa"/>
           </w:tcPr>
           <w:p>
             <w:pPr>
@@ -4265,7 +4560,7 @@
         </w:tc>
         <w:tc>
           <w:tcPr>
-            <w:tcW w:w="1440" w:type="dxa"/>
+            <w:tcW w:w="1298" w:type="dxa"/>
           </w:tcPr>
           <w:p>
             <w:pPr>
@@ -4279,17 +4574,17 @@
         </w:tc>
         <w:tc>
           <w:tcPr>
-            <w:tcW w:w="785" w:type="dxa"/>
-          </w:tcPr>
-          <w:p>
-            <w:pPr>
-              <w:pStyle w:val="TableText"/>
-            </w:pPr>
-          </w:p>
-        </w:tc>
-        <w:tc>
-          <w:tcPr>
-            <w:tcW w:w="786" w:type="dxa"/>
+            <w:tcW w:w="1069" w:type="dxa"/>
+          </w:tcPr>
+          <w:p>
+            <w:pPr>
+              <w:pStyle w:val="TableText"/>
+            </w:pPr>
+          </w:p>
+        </w:tc>
+        <w:tc>
+          <w:tcPr>
+            <w:tcW w:w="3132" w:type="dxa"/>
           </w:tcPr>
           <w:p>
             <w:pPr>

</xml_diff>